<commit_message>
latex: scotus amicus and merits briefs on stock pdflatex (tgschola) (fb-595.47)
- fontspec + vendored Schola -> \usepackage[T1]{fontenc} + \usepackage{tgschola} (TeX Gyre Schola,
  the Century face of Rule 33.1(b), from stock TeX Live).
- headheight/headsep are zero inside geometry: zeroed after it, they moved the text block 37 pt up
  (body text at y=37, inside the 3/4 in margin of Rule 33.1(c), and the folio inside the text area,
  where Gate 0 read it as body text). This was the DEF-CONT-001 failure of both folders on master;
  the folio now sits where typst puts it.
- amicus INPUT: '\*10 Ring Precision, Inc. v. Jones*' -> '*10 Ring Precision, Inc. v. Jones*'
  (the filed brief, FILED-EXAMPLE-amicus-brief-2, sets the case name in italics; the escaped
  asterisk printed literal asterisks in typst and made pandoc open emphasis at 'Jones*'). typst
  and docx re-rendered from it; typst stamp refreshed.
- check.sh --engine latex green for both; typst green for amicus.
</commit_message>
<xml_diff>
--- a/courts/supreme-court-of-the-united-states/amicus-brief/usage/OUTPUT-amicus-brief.docx
+++ b/courts/supreme-court-of-the-united-states/amicus-brief/usage/OUTPUT-amicus-brief.docx
@@ -555,7 +555,7 @@
         <w:rPr>
           <w:rStyle w:val="FootnoteReference"/>
         </w:rPr>
-        <w:footnoteReference w:id="20"/>
+        <w:footnoteReference w:id="9"/>
       </w:r>
       <w:r>
         <w:t xml:space="preserve"> </w:t>
@@ -906,7 +906,7 @@
         <w:rPr>
           <w:rStyle w:val="FootnoteReference"/>
         </w:rPr>
-        <w:footnoteReference w:id="21"/>
+        <w:footnoteReference w:id="10"/>
       </w:r>
       <w:r>
         <w:t xml:space="preserve"> </w:t>
@@ -1427,7 +1427,7 @@
         <w:rPr>
           <w:rStyle w:val="FootnoteReference"/>
         </w:rPr>
-        <w:footnoteReference w:id="22"/>
+        <w:footnoteReference w:id="11"/>
       </w:r>
       <w:r>
         <w:t xml:space="preserve"> </w:t>
@@ -1649,8 +1649,8 @@
       </w:r>
     </w:p>
     <w:sectPr>
-      <w:pgSz w:h="13320" w:w="8820"/>
-      <w:pgMar w:bottom="1620" w:footer="540" w:gutter="0" w:header="0" w:left="1440" w:right="1440" w:top="1440"/>
+      <w:pgSz w:w="8820" w:h="13320"/>
+      <w:pgMar w:top="1440" w:right="1440" w:bottom="1620" w:left="1440" w:header="0" w:footer="540" w:gutter="0"/>
       <w:footnotePr>
         <w:numRestart w:val="eachSect"/>
       </w:footnotePr>
@@ -1679,7 +1679,7 @@
       </w:r>
     </w:p>
   </w:footnote>
-  <w:footnote w:id="20">
+  <w:footnote w:id="9">
     <w:p>
       <w:pPr>
         <w:pStyle w:val="FootnoteText"/>
@@ -1698,7 +1698,7 @@
       </w:r>
     </w:p>
   </w:footnote>
-  <w:footnote w:id="21">
+  <w:footnote w:id="10">
     <w:p>
       <w:pPr>
         <w:pStyle w:val="FootnoteText"/>
@@ -1762,7 +1762,7 @@
       </w:r>
     </w:p>
   </w:footnote>
-  <w:footnote w:id="22">
+  <w:footnote w:id="11">
     <w:p>
       <w:pPr>
         <w:pStyle w:val="FootnoteText"/>
@@ -1896,10 +1896,10 @@
   <w:docDefaults>
     <w:rPrDefault>
       <w:rPr>
-        <w:rFonts w:ascii="TeX Gyre Schola" w:cs="TeX Gyre Schola" w:eastAsia="TeX Gyre Schola" w:hAnsi="TeX Gyre Schola"/>
+        <w:rFonts w:ascii="TeX Gyre Schola" w:hAnsi="TeX Gyre Schola" w:eastAsia="TeX Gyre Schola" w:cs="TeX Gyre Schola"/>
         <w:sz w:val="24"/>
         <w:szCs w:val="24"/>
-        <w:lang w:bidi="ar-SA" w:eastAsia="zh-CN" w:val="en-US"/>
+        <w:lang w:val="en-US" w:eastAsia="zh-CN" w:bidi="ar-SA"/>
       </w:rPr>
     </w:rPrDefault>
     <w:pPrDefault>
@@ -1908,36 +1908,36 @@
       </w:pPr>
     </w:pPrDefault>
   </w:docDefaults>
-  <w:latentStyles w:count="276" w:defLockedState="0" w:defQFormat="0" w:defSemiHidden="0" w:defUIPriority="0" w:defUnhideWhenUsed="0"/>
-  <w:style w:default="1" w:styleId="Normal" w:type="paragraph">
+  <w:latentStyles w:defLockedState="0" w:defUIPriority="0" w:defSemiHidden="0" w:defUnhideWhenUsed="0" w:defQFormat="0" w:count="276"/>
+  <w:style w:type="paragraph" w:default="1" w:styleId="Normal">
     <w:name w:val="Normal"/>
     <w:qFormat/>
   </w:style>
-  <w:style w:styleId="BodyText" w:type="paragraph">
+  <w:style w:type="paragraph" w:styleId="BodyText">
     <w:name w:val="Body Text"/>
     <w:basedOn w:val="Normal"/>
     <w:link w:val="BodyTextChar"/>
     <w:qFormat/>
     <w:pPr>
-      <w:spacing w:after="240" w:before="0" w:line="280" w:lineRule="exact"/>
+      <w:spacing w:before="0" w:after="240" w:line="280" w:lineRule="exact"/>
       <w:ind w:firstLine="576"/>
     </w:pPr>
   </w:style>
-  <w:style w:customStyle="1" w:styleId="FirstParagraph" w:type="paragraph">
+  <w:style w:type="paragraph" w:customStyle="1" w:styleId="FirstParagraph">
     <w:name w:val="First Paragraph"/>
     <w:basedOn w:val="BodyText"/>
     <w:next w:val="BodyText"/>
     <w:qFormat/>
   </w:style>
-  <w:style w:customStyle="1" w:styleId="Compact" w:type="paragraph">
+  <w:style w:type="paragraph" w:customStyle="1" w:styleId="Compact">
     <w:name w:val="Compact"/>
     <w:basedOn w:val="BodyText"/>
     <w:qFormat/>
     <w:pPr>
-      <w:spacing w:after="36" w:before="36"/>
+      <w:spacing w:before="36" w:after="36"/>
     </w:pPr>
   </w:style>
-  <w:style w:styleId="Title" w:type="paragraph">
+  <w:style w:type="paragraph" w:styleId="Title">
     <w:name w:val="Title"/>
     <w:basedOn w:val="Normal"/>
     <w:next w:val="BodyText"/>
@@ -1951,24 +1951,24 @@
       <w:jc w:val="center"/>
     </w:pPr>
     <w:rPr>
-      <w:rFonts w:ascii="TeX Gyre Schola" w:cstheme="majorBidi" w:eastAsiaTheme="majorEastAsia" w:hAnsi="TeX Gyre Schola"/>
+      <w:rFonts w:ascii="TeX Gyre Schola" w:eastAsiaTheme="majorEastAsia" w:hAnsi="TeX Gyre Schola" w:cstheme="majorBidi"/>
       <w:sz w:val="56"/>
       <w:szCs w:val="56"/>
     </w:rPr>
   </w:style>
-  <w:style w:customStyle="1" w:styleId="TitleChar" w:type="character">
+  <w:style w:type="character" w:customStyle="1" w:styleId="TitleChar">
     <w:name w:val="Title Char"/>
     <w:basedOn w:val="DefaultParagraphFont"/>
     <w:link w:val="Title"/>
     <w:uiPriority w:val="10"/>
     <w:rsid w:val="00A10FD9"/>
     <w:rPr>
-      <w:rFonts w:ascii="TeX Gyre Schola" w:cstheme="majorBidi" w:eastAsiaTheme="majorEastAsia" w:hAnsi="TeX Gyre Schola"/>
+      <w:rFonts w:ascii="TeX Gyre Schola" w:eastAsiaTheme="majorEastAsia" w:hAnsi="TeX Gyre Schola" w:cstheme="majorBidi"/>
       <w:sz w:val="56"/>
       <w:szCs w:val="56"/>
     </w:rPr>
   </w:style>
-  <w:style w:styleId="Subtitle" w:type="paragraph">
+  <w:style w:type="paragraph" w:styleId="Subtitle">
     <w:name w:val="Subtitle"/>
     <w:basedOn w:val="Title"/>
     <w:next w:val="BodyText"/>
@@ -1982,27 +1982,27 @@
       </w:numPr>
     </w:pPr>
     <w:rPr>
-      <w:rFonts w:cstheme="majorBidi" w:eastAsiaTheme="majorEastAsia"/>
+      <w:rFonts w:eastAsiaTheme="majorEastAsia" w:cstheme="majorBidi"/>
       <w:spacing w:val="15"/>
       <w:sz w:val="28"/>
       <w:szCs w:val="28"/>
     </w:rPr>
   </w:style>
-  <w:style w:customStyle="1" w:styleId="SubtitleChar" w:type="character">
+  <w:style w:type="character" w:customStyle="1" w:styleId="SubtitleChar">
     <w:name w:val="Subtitle Char"/>
     <w:basedOn w:val="DefaultParagraphFont"/>
     <w:link w:val="Subtitle"/>
     <w:uiPriority w:val="11"/>
     <w:rsid w:val="00A10FD9"/>
     <w:rPr>
-      <w:rFonts w:cstheme="majorBidi" w:eastAsiaTheme="majorEastAsia"/>
-      <w:color w:themeColor="text1" w:themeTint="A6" w:val="595959"/>
+      <w:rFonts w:eastAsiaTheme="majorEastAsia" w:cstheme="majorBidi"/>
+      <w:color w:val="595959" w:themeColor="text1" w:themeTint="A6"/>
       <w:spacing w:val="15"/>
       <w:sz w:val="28"/>
       <w:szCs w:val="28"/>
     </w:rPr>
   </w:style>
-  <w:style w:customStyle="1" w:styleId="Author" w:type="paragraph">
+  <w:style w:type="paragraph" w:customStyle="1" w:styleId="Author">
     <w:name w:val="Author"/>
     <w:basedOn w:val="Title"/>
     <w:next w:val="BodyText"/>
@@ -2016,7 +2016,7 @@
       <w:szCs w:val="24"/>
     </w:rPr>
   </w:style>
-  <w:style w:styleId="Date" w:type="paragraph">
+  <w:style w:type="paragraph" w:styleId="Date">
     <w:name w:val="Date"/>
     <w:basedOn w:val="Title"/>
     <w:next w:val="BodyText"/>
@@ -2030,7 +2030,7 @@
       <w:szCs w:val="24"/>
     </w:rPr>
   </w:style>
-  <w:style w:customStyle="1" w:styleId="AbstractTitle" w:type="paragraph">
+  <w:style w:type="paragraph" w:customStyle="1" w:styleId="AbstractTitle">
     <w:name w:val="Abstract Title"/>
     <w:basedOn w:val="Normal"/>
     <w:next w:val="Abstract"/>
@@ -2038,7 +2038,7 @@
     <w:pPr>
       <w:keepNext/>
       <w:keepLines/>
-      <w:spacing w:after="0" w:before="300"/>
+      <w:spacing w:before="300" w:after="0"/>
       <w:jc w:val="center"/>
     </w:pPr>
     <w:rPr>
@@ -2047,7 +2047,7 @@
       <w:szCs w:val="20"/>
     </w:rPr>
   </w:style>
-  <w:style w:customStyle="1" w:styleId="Abstract" w:type="paragraph">
+  <w:style w:type="paragraph" w:customStyle="1" w:styleId="Abstract">
     <w:name w:val="Abstract"/>
     <w:basedOn w:val="Normal"/>
     <w:next w:val="BodyText"/>
@@ -2055,14 +2055,14 @@
     <w:pPr>
       <w:keepNext/>
       <w:keepLines/>
-      <w:spacing w:after="300" w:before="100"/>
+      <w:spacing w:before="100" w:after="300"/>
     </w:pPr>
     <w:rPr>
       <w:sz w:val="20"/>
       <w:szCs w:val="20"/>
     </w:rPr>
   </w:style>
-  <w:style w:styleId="Bibliography" w:type="paragraph">
+  <w:style w:type="paragraph" w:styleId="Bibliography">
     <w:name w:val="Bibliography"/>
     <w:basedOn w:val="Normal"/>
     <w:next w:val="Bibliography"/>
@@ -2070,7 +2070,7 @@
     <w:pPr/>
     <w:rPr/>
   </w:style>
-  <w:style w:styleId="Heading1" w:type="paragraph">
+  <w:style w:type="paragraph" w:styleId="Heading1">
     <w:name w:val="heading 1"/>
     <w:basedOn w:val="Normal"/>
     <w:next w:val="BodyText"/>
@@ -2081,17 +2081,17 @@
     <w:pPr>
       <w:keepNext/>
       <w:keepLines/>
-      <w:spacing w:after="80" w:before="360"/>
+      <w:spacing w:before="360" w:after="80"/>
       <w:outlineLvl w:val="0"/>
     </w:pPr>
     <w:rPr>
-      <w:rFonts w:ascii="TeX Gyre Schola" w:cstheme="majorBidi" w:eastAsiaTheme="majorEastAsia" w:hAnsi="TeX Gyre Schola"/>
-      <w:color w:themeColor="accent1" w:themeShade="BF" w:val="0F4761"/>
+      <w:rFonts w:ascii="TeX Gyre Schola" w:eastAsiaTheme="majorEastAsia" w:hAnsi="TeX Gyre Schola" w:cstheme="majorBidi"/>
+      <w:color w:val="0F4761" w:themeColor="accent1" w:themeShade="BF"/>
       <w:sz w:val="40"/>
       <w:szCs w:val="40"/>
     </w:rPr>
   </w:style>
-  <w:style w:styleId="Heading2" w:type="paragraph">
+  <w:style w:type="paragraph" w:styleId="Heading2">
     <w:name w:val="heading 2"/>
     <w:basedOn w:val="Normal"/>
     <w:next w:val="BodyText"/>
@@ -2104,17 +2104,17 @@
     <w:pPr>
       <w:keepNext/>
       <w:keepLines/>
-      <w:spacing w:after="80" w:before="160"/>
+      <w:spacing w:before="160" w:after="80"/>
       <w:outlineLvl w:val="1"/>
     </w:pPr>
     <w:rPr>
-      <w:rFonts w:ascii="TeX Gyre Schola" w:cstheme="majorBidi" w:eastAsiaTheme="majorEastAsia" w:hAnsi="TeX Gyre Schola"/>
-      <w:color w:themeColor="accent1" w:themeShade="BF" w:val="0F4761"/>
+      <w:rFonts w:ascii="TeX Gyre Schola" w:eastAsiaTheme="majorEastAsia" w:hAnsi="TeX Gyre Schola" w:cstheme="majorBidi"/>
+      <w:color w:val="0F4761" w:themeColor="accent1" w:themeShade="BF"/>
       <w:sz w:val="32"/>
       <w:szCs w:val="32"/>
     </w:rPr>
   </w:style>
-  <w:style w:styleId="Heading3" w:type="paragraph">
+  <w:style w:type="paragraph" w:styleId="Heading3">
     <w:name w:val="heading 3"/>
     <w:basedOn w:val="Normal"/>
     <w:next w:val="BodyText"/>
@@ -2127,17 +2127,17 @@
     <w:pPr>
       <w:keepNext/>
       <w:keepLines/>
-      <w:spacing w:after="80" w:before="160"/>
+      <w:spacing w:before="160" w:after="80"/>
       <w:outlineLvl w:val="2"/>
     </w:pPr>
     <w:rPr>
-      <w:rFonts w:cstheme="majorBidi" w:eastAsiaTheme="majorEastAsia"/>
-      <w:color w:themeColor="accent1" w:themeShade="BF" w:val="0F4761"/>
+      <w:rFonts w:eastAsiaTheme="majorEastAsia" w:cstheme="majorBidi"/>
+      <w:color w:val="0F4761" w:themeColor="accent1" w:themeShade="BF"/>
       <w:sz w:val="28"/>
       <w:szCs w:val="28"/>
     </w:rPr>
   </w:style>
-  <w:style w:styleId="Heading4" w:type="paragraph">
+  <w:style w:type="paragraph" w:styleId="Heading4">
     <w:name w:val="heading 4"/>
     <w:basedOn w:val="Normal"/>
     <w:next w:val="BodyText"/>
@@ -2150,17 +2150,17 @@
     <w:pPr>
       <w:keepNext/>
       <w:keepLines/>
-      <w:spacing w:after="40" w:before="80"/>
+      <w:spacing w:before="80" w:after="40"/>
       <w:outlineLvl w:val="3"/>
     </w:pPr>
     <w:rPr>
-      <w:rFonts w:cstheme="majorBidi" w:eastAsiaTheme="majorEastAsia"/>
+      <w:rFonts w:eastAsiaTheme="majorEastAsia" w:cstheme="majorBidi"/>
       <w:i/>
       <w:iCs/>
-      <w:color w:themeColor="accent1" w:themeShade="BF" w:val="0F4761"/>
-    </w:rPr>
-  </w:style>
-  <w:style w:styleId="Heading5" w:type="paragraph">
+      <w:color w:val="0F4761" w:themeColor="accent1" w:themeShade="BF"/>
+    </w:rPr>
+  </w:style>
+  <w:style w:type="paragraph" w:styleId="Heading5">
     <w:name w:val="heading 5"/>
     <w:basedOn w:val="Normal"/>
     <w:next w:val="BodyText"/>
@@ -2173,15 +2173,15 @@
     <w:pPr>
       <w:keepNext/>
       <w:keepLines/>
-      <w:spacing w:after="40" w:before="80"/>
+      <w:spacing w:before="80" w:after="40"/>
       <w:outlineLvl w:val="4"/>
     </w:pPr>
     <w:rPr>
-      <w:rFonts w:cstheme="majorBidi" w:eastAsiaTheme="majorEastAsia"/>
-      <w:color w:themeColor="accent1" w:themeShade="BF" w:val="0F4761"/>
-    </w:rPr>
-  </w:style>
-  <w:style w:styleId="Heading6" w:type="paragraph">
+      <w:rFonts w:eastAsiaTheme="majorEastAsia" w:cstheme="majorBidi"/>
+      <w:color w:val="0F4761" w:themeColor="accent1" w:themeShade="BF"/>
+    </w:rPr>
+  </w:style>
+  <w:style w:type="paragraph" w:styleId="Heading6">
     <w:name w:val="heading 6"/>
     <w:basedOn w:val="Normal"/>
     <w:next w:val="BodyText"/>
@@ -2194,17 +2194,17 @@
     <w:pPr>
       <w:keepNext/>
       <w:keepLines/>
-      <w:spacing w:after="0" w:before="40"/>
+      <w:spacing w:before="40" w:after="0"/>
       <w:outlineLvl w:val="5"/>
     </w:pPr>
     <w:rPr>
-      <w:rFonts w:cstheme="majorBidi" w:eastAsiaTheme="majorEastAsia"/>
+      <w:rFonts w:eastAsiaTheme="majorEastAsia" w:cstheme="majorBidi"/>
       <w:i/>
       <w:iCs/>
-      <w:color w:themeColor="text1" w:themeTint="A6" w:val="595959"/>
-    </w:rPr>
-  </w:style>
-  <w:style w:styleId="Heading7" w:type="paragraph">
+      <w:color w:val="595959" w:themeColor="text1" w:themeTint="A6"/>
+    </w:rPr>
+  </w:style>
+  <w:style w:type="paragraph" w:styleId="Heading7">
     <w:name w:val="heading 7"/>
     <w:basedOn w:val="Normal"/>
     <w:next w:val="BodyText"/>
@@ -2217,15 +2217,15 @@
     <w:pPr>
       <w:keepNext/>
       <w:keepLines/>
-      <w:spacing w:after="0" w:before="40"/>
+      <w:spacing w:before="40" w:after="0"/>
       <w:outlineLvl w:val="6"/>
     </w:pPr>
     <w:rPr>
-      <w:rFonts w:cstheme="majorBidi" w:eastAsiaTheme="majorEastAsia"/>
-      <w:color w:themeColor="text1" w:themeTint="A6" w:val="595959"/>
-    </w:rPr>
-  </w:style>
-  <w:style w:styleId="Heading8" w:type="paragraph">
+      <w:rFonts w:eastAsiaTheme="majorEastAsia" w:cstheme="majorBidi"/>
+      <w:color w:val="595959" w:themeColor="text1" w:themeTint="A6"/>
+    </w:rPr>
+  </w:style>
+  <w:style w:type="paragraph" w:styleId="Heading8">
     <w:name w:val="heading 8"/>
     <w:basedOn w:val="Normal"/>
     <w:next w:val="BodyText"/>
@@ -2242,13 +2242,13 @@
       <w:outlineLvl w:val="7"/>
     </w:pPr>
     <w:rPr>
-      <w:rFonts w:cstheme="majorBidi" w:eastAsiaTheme="majorEastAsia"/>
+      <w:rFonts w:eastAsiaTheme="majorEastAsia" w:cstheme="majorBidi"/>
       <w:i/>
       <w:iCs/>
-      <w:color w:themeColor="text1" w:themeTint="D8" w:val="272727"/>
-    </w:rPr>
-  </w:style>
-  <w:style w:styleId="Heading9" w:type="paragraph">
+      <w:color w:val="272727" w:themeColor="text1" w:themeTint="D8"/>
+    </w:rPr>
+  </w:style>
+  <w:style w:type="paragraph" w:styleId="Heading9">
     <w:name w:val="heading 9"/>
     <w:basedOn w:val="Normal"/>
     <w:next w:val="BodyText"/>
@@ -2265,24 +2265,24 @@
       <w:outlineLvl w:val="8"/>
     </w:pPr>
     <w:rPr>
-      <w:rFonts w:cstheme="majorBidi" w:eastAsiaTheme="majorEastAsia"/>
-      <w:color w:themeColor="text1" w:themeTint="D8" w:val="272727"/>
-    </w:rPr>
-  </w:style>
-  <w:style w:customStyle="1" w:styleId="Heading1Char" w:type="character">
+      <w:rFonts w:eastAsiaTheme="majorEastAsia" w:cstheme="majorBidi"/>
+      <w:color w:val="272727" w:themeColor="text1" w:themeTint="D8"/>
+    </w:rPr>
+  </w:style>
+  <w:style w:type="character" w:customStyle="1" w:styleId="Heading1Char">
     <w:name w:val="Heading 1 Char"/>
     <w:basedOn w:val="DefaultParagraphFont"/>
     <w:link w:val="Heading1"/>
     <w:uiPriority w:val="9"/>
     <w:rsid w:val="00A10FD9"/>
     <w:rPr>
-      <w:rFonts w:ascii="TeX Gyre Schola" w:cstheme="majorBidi" w:eastAsiaTheme="majorEastAsia" w:hAnsi="TeX Gyre Schola"/>
-      <w:color w:themeColor="accent1" w:themeShade="BF" w:val="0F4761"/>
+      <w:rFonts w:ascii="TeX Gyre Schola" w:eastAsiaTheme="majorEastAsia" w:hAnsi="TeX Gyre Schola" w:cstheme="majorBidi"/>
+      <w:color w:val="0F4761" w:themeColor="accent1" w:themeShade="BF"/>
       <w:sz w:val="40"/>
       <w:szCs w:val="40"/>
     </w:rPr>
   </w:style>
-  <w:style w:customStyle="1" w:styleId="Heading2Char" w:type="character">
+  <w:style w:type="character" w:customStyle="1" w:styleId="Heading2Char">
     <w:name w:val="Heading 2 Char"/>
     <w:basedOn w:val="DefaultParagraphFont"/>
     <w:link w:val="Heading2"/>
@@ -2290,13 +2290,13 @@
     <w:semiHidden/>
     <w:rsid w:val="00A10FD9"/>
     <w:rPr>
-      <w:rFonts w:ascii="TeX Gyre Schola" w:cstheme="majorBidi" w:eastAsiaTheme="majorEastAsia" w:hAnsi="TeX Gyre Schola"/>
-      <w:color w:themeColor="accent1" w:themeShade="BF" w:val="0F4761"/>
+      <w:rFonts w:ascii="TeX Gyre Schola" w:eastAsiaTheme="majorEastAsia" w:hAnsi="TeX Gyre Schola" w:cstheme="majorBidi"/>
+      <w:color w:val="0F4761" w:themeColor="accent1" w:themeShade="BF"/>
       <w:sz w:val="32"/>
       <w:szCs w:val="32"/>
     </w:rPr>
   </w:style>
-  <w:style w:customStyle="1" w:styleId="Heading3Char" w:type="character">
+  <w:style w:type="character" w:customStyle="1" w:styleId="Heading3Char">
     <w:name w:val="Heading 3 Char"/>
     <w:basedOn w:val="DefaultParagraphFont"/>
     <w:link w:val="Heading3"/>
@@ -2304,13 +2304,13 @@
     <w:semiHidden/>
     <w:rsid w:val="00A10FD9"/>
     <w:rPr>
-      <w:rFonts w:cstheme="majorBidi" w:eastAsiaTheme="majorEastAsia"/>
-      <w:color w:themeColor="accent1" w:themeShade="BF" w:val="0F4761"/>
+      <w:rFonts w:eastAsiaTheme="majorEastAsia" w:cstheme="majorBidi"/>
+      <w:color w:val="0F4761" w:themeColor="accent1" w:themeShade="BF"/>
       <w:sz w:val="28"/>
       <w:szCs w:val="28"/>
     </w:rPr>
   </w:style>
-  <w:style w:customStyle="1" w:styleId="Heading4Char" w:type="character">
+  <w:style w:type="character" w:customStyle="1" w:styleId="Heading4Char">
     <w:name w:val="Heading 4 Char"/>
     <w:basedOn w:val="DefaultParagraphFont"/>
     <w:link w:val="Heading4"/>
@@ -2318,13 +2318,13 @@
     <w:semiHidden/>
     <w:rsid w:val="00A10FD9"/>
     <w:rPr>
-      <w:rFonts w:cstheme="majorBidi" w:eastAsiaTheme="majorEastAsia"/>
+      <w:rFonts w:eastAsiaTheme="majorEastAsia" w:cstheme="majorBidi"/>
       <w:i/>
       <w:iCs/>
-      <w:color w:themeColor="accent1" w:themeShade="BF" w:val="0F4761"/>
-    </w:rPr>
-  </w:style>
-  <w:style w:customStyle="1" w:styleId="Heading5Char" w:type="character">
+      <w:color w:val="0F4761" w:themeColor="accent1" w:themeShade="BF"/>
+    </w:rPr>
+  </w:style>
+  <w:style w:type="character" w:customStyle="1" w:styleId="Heading5Char">
     <w:name w:val="Heading 5 Char"/>
     <w:basedOn w:val="DefaultParagraphFont"/>
     <w:link w:val="Heading5"/>
@@ -2332,11 +2332,11 @@
     <w:semiHidden/>
     <w:rsid w:val="00A10FD9"/>
     <w:rPr>
-      <w:rFonts w:cstheme="majorBidi" w:eastAsiaTheme="majorEastAsia"/>
-      <w:color w:themeColor="accent1" w:themeShade="BF" w:val="0F4761"/>
-    </w:rPr>
-  </w:style>
-  <w:style w:customStyle="1" w:styleId="Heading6Char" w:type="character">
+      <w:rFonts w:eastAsiaTheme="majorEastAsia" w:cstheme="majorBidi"/>
+      <w:color w:val="0F4761" w:themeColor="accent1" w:themeShade="BF"/>
+    </w:rPr>
+  </w:style>
+  <w:style w:type="character" w:customStyle="1" w:styleId="Heading6Char">
     <w:name w:val="Heading 6 Char"/>
     <w:basedOn w:val="DefaultParagraphFont"/>
     <w:link w:val="Heading6"/>
@@ -2344,13 +2344,13 @@
     <w:semiHidden/>
     <w:rsid w:val="00A10FD9"/>
     <w:rPr>
-      <w:rFonts w:cstheme="majorBidi" w:eastAsiaTheme="majorEastAsia"/>
+      <w:rFonts w:eastAsiaTheme="majorEastAsia" w:cstheme="majorBidi"/>
       <w:i/>
       <w:iCs/>
-      <w:color w:themeColor="text1" w:themeTint="A6" w:val="595959"/>
-    </w:rPr>
-  </w:style>
-  <w:style w:customStyle="1" w:styleId="Heading7Char" w:type="character">
+      <w:color w:val="595959" w:themeColor="text1" w:themeTint="A6"/>
+    </w:rPr>
+  </w:style>
+  <w:style w:type="character" w:customStyle="1" w:styleId="Heading7Char">
     <w:name w:val="Heading 7 Char"/>
     <w:basedOn w:val="DefaultParagraphFont"/>
     <w:link w:val="Heading7"/>
@@ -2358,11 +2358,11 @@
     <w:semiHidden/>
     <w:rsid w:val="00A10FD9"/>
     <w:rPr>
-      <w:rFonts w:cstheme="majorBidi" w:eastAsiaTheme="majorEastAsia"/>
-      <w:color w:themeColor="text1" w:themeTint="A6" w:val="595959"/>
-    </w:rPr>
-  </w:style>
-  <w:style w:customStyle="1" w:styleId="Heading8Char" w:type="character">
+      <w:rFonts w:eastAsiaTheme="majorEastAsia" w:cstheme="majorBidi"/>
+      <w:color w:val="595959" w:themeColor="text1" w:themeTint="A6"/>
+    </w:rPr>
+  </w:style>
+  <w:style w:type="character" w:customStyle="1" w:styleId="Heading8Char">
     <w:name w:val="Heading 8 Char"/>
     <w:basedOn w:val="DefaultParagraphFont"/>
     <w:link w:val="Heading8"/>
@@ -2370,13 +2370,13 @@
     <w:semiHidden/>
     <w:rsid w:val="00A10FD9"/>
     <w:rPr>
-      <w:rFonts w:cstheme="majorBidi" w:eastAsiaTheme="majorEastAsia"/>
+      <w:rFonts w:eastAsiaTheme="majorEastAsia" w:cstheme="majorBidi"/>
       <w:i/>
       <w:iCs/>
-      <w:color w:themeColor="text1" w:themeTint="D8" w:val="272727"/>
-    </w:rPr>
-  </w:style>
-  <w:style w:customStyle="1" w:styleId="Heading9Char" w:type="character">
+      <w:color w:val="272727" w:themeColor="text1" w:themeTint="D8"/>
+    </w:rPr>
+  </w:style>
+  <w:style w:type="character" w:customStyle="1" w:styleId="Heading9Char">
     <w:name w:val="Heading 9 Char"/>
     <w:basedOn w:val="DefaultParagraphFont"/>
     <w:link w:val="Heading9"/>
@@ -2384,11 +2384,11 @@
     <w:semiHidden/>
     <w:rsid w:val="00A10FD9"/>
     <w:rPr>
-      <w:rFonts w:cstheme="majorBidi" w:eastAsiaTheme="majorEastAsia"/>
-      <w:color w:themeColor="text1" w:themeTint="D8" w:val="272727"/>
-    </w:rPr>
-  </w:style>
-  <w:style w:styleId="BlockText" w:type="paragraph">
+      <w:rFonts w:eastAsiaTheme="majorEastAsia" w:cstheme="majorBidi"/>
+      <w:color w:val="272727" w:themeColor="text1" w:themeTint="D8"/>
+    </w:rPr>
+  </w:style>
+  <w:style w:type="paragraph" w:styleId="BlockText">
     <w:name w:val="Block Text"/>
     <w:basedOn w:val="BodyText"/>
     <w:next w:val="BodyText"/>
@@ -2396,15 +2396,15 @@
     <w:unhideWhenUsed/>
     <w:qFormat/>
     <w:pPr>
-      <w:spacing w:after="100" w:before="100"/>
+      <w:spacing w:before="100" w:after="100"/>
       <w:ind w:firstLine="0" w:left="480" w:right="480"/>
     </w:pPr>
   </w:style>
-  <w:style w:styleId="FootnoteText" w:type="paragraph">
+  <w:style w:type="paragraph" w:styleId="FootnoteText">
     <w:name w:val="Footnote Text"/>
     <w:basedOn w:val="Normal"/>
     <w:pPr>
-      <w:spacing w:after="0" w:before="0" w:line="240" w:lineRule="exact"/>
+      <w:spacing w:before="0" w:after="0" w:line="240" w:lineRule="exact"/>
     </w:pPr>
     <w:rPr>
       <w:sz w:val="20"/>
@@ -2415,7 +2415,7 @@
     <w:unhideWhenUsed/>
     <w:qFormat/>
   </w:style>
-  <w:style w:styleId="FootnoteBlockText" w:type="paragraph">
+  <w:style w:type="paragraph" w:styleId="FootnoteBlockText">
     <w:name w:val="Footnote Block Text"/>
     <w:basedOn w:val="FootnoteText"/>
     <w:next w:val="FootnoteText"/>
@@ -2423,26 +2423,26 @@
     <w:unhideWhenUsed/>
     <w:qFormat/>
     <w:pPr>
-      <w:spacing w:after="100" w:before="100"/>
+      <w:spacing w:before="100" w:after="100"/>
       <w:ind w:firstLine="0" w:left="480" w:right="480"/>
     </w:pPr>
   </w:style>
-  <w:style w:default="1" w:styleId="DefaultParagraphFont" w:type="character">
+  <w:style w:type="character" w:default="1" w:styleId="DefaultParagraphFont">
     <w:name w:val="Default Paragraph Font"/>
     <w:semiHidden/>
     <w:unhideWhenUsed/>
   </w:style>
-  <w:style w:default="1" w:styleId="Table" w:type="table">
+  <w:style w:type="table" w:default="1" w:styleId="Table">
     <w:name w:val="Table"/>
     <w:basedOn w:val="TableNormal"/>
     <w:qFormat/>
     <w:tblPr>
-      <w:tblInd w:type="dxa" w:w="0"/>
+      <w:tblInd w:w="0" w:type="dxa"/>
       <w:tblCellMar>
-        <w:top w:type="dxa" w:w="0"/>
-        <w:left w:type="dxa" w:w="108"/>
-        <w:bottom w:type="dxa" w:w="0"/>
-        <w:right w:type="dxa" w:w="108"/>
+        <w:top w:w="0" w:type="dxa"/>
+        <w:left w:w="108" w:type="dxa"/>
+        <w:bottom w:w="0" w:type="dxa"/>
+        <w:right w:w="108" w:type="dxa"/>
       </w:tblCellMar>
     </w:tblPr>
     <w:tblStylePr w:type="firstRow">
@@ -2454,7 +2454,7 @@
       </w:tcPr>
     </w:tblStylePr>
   </w:style>
-  <w:style w:customStyle="1" w:styleId="DefinitionTerm" w:type="paragraph">
+  <w:style w:type="paragraph" w:customStyle="1" w:styleId="DefinitionTerm">
     <w:name w:val="Definition Term"/>
     <w:basedOn w:val="Normal"/>
     <w:next w:val="Definition"/>
@@ -2467,49 +2467,49 @@
       <w:b/>
     </w:rPr>
   </w:style>
-  <w:style w:customStyle="1" w:styleId="Definition" w:type="paragraph">
+  <w:style w:type="paragraph" w:customStyle="1" w:styleId="Definition">
     <w:name w:val="Definition"/>
     <w:basedOn w:val="Normal"/>
   </w:style>
-  <w:style w:styleId="Caption" w:type="paragraph">
+  <w:style w:type="paragraph" w:styleId="Caption">
     <w:name w:val="Caption"/>
     <w:basedOn w:val="Normal"/>
     <w:link w:val="BodyTextChar"/>
     <w:pPr>
-      <w:spacing w:after="120" w:before="0"/>
+      <w:spacing w:before="0" w:after="120"/>
     </w:pPr>
     <w:rPr>
       <w:i/>
     </w:rPr>
   </w:style>
-  <w:style w:customStyle="1" w:styleId="TableCaption" w:type="paragraph">
+  <w:style w:type="paragraph" w:customStyle="1" w:styleId="TableCaption">
     <w:name w:val="Table Caption"/>
     <w:basedOn w:val="Caption"/>
     <w:pPr>
       <w:keepNext/>
     </w:pPr>
   </w:style>
-  <w:style w:customStyle="1" w:styleId="ImageCaption" w:type="paragraph">
+  <w:style w:type="paragraph" w:customStyle="1" w:styleId="ImageCaption">
     <w:name w:val="Image Caption"/>
     <w:basedOn w:val="Caption"/>
   </w:style>
-  <w:style w:customStyle="1" w:styleId="Figure" w:type="paragraph">
+  <w:style w:type="paragraph" w:customStyle="1" w:styleId="Figure">
     <w:name w:val="Figure"/>
     <w:basedOn w:val="Normal"/>
   </w:style>
-  <w:style w:customStyle="1" w:styleId="CaptionedFigure" w:type="paragraph">
+  <w:style w:type="paragraph" w:customStyle="1" w:styleId="CaptionedFigure">
     <w:name w:val="Captioned Figure"/>
     <w:basedOn w:val="Figure"/>
     <w:pPr>
       <w:keepNext/>
     </w:pPr>
   </w:style>
-  <w:style w:customStyle="1" w:styleId="BodyTextChar" w:type="character">
+  <w:style w:type="character" w:customStyle="1" w:styleId="BodyTextChar">
     <w:name w:val="Body Text Char"/>
     <w:basedOn w:val="DefaultParagraphFont"/>
     <w:link w:val="BodyText"/>
   </w:style>
-  <w:style w:customStyle="1" w:styleId="VerbatimChar" w:type="character">
+  <w:style w:type="character" w:customStyle="1" w:styleId="VerbatimChar">
     <w:name w:val="Verbatim Char"/>
     <w:basedOn w:val="BodyTextChar"/>
     <w:rPr>
@@ -2517,25 +2517,25 @@
       <w:sz w:val="22"/>
     </w:rPr>
   </w:style>
-  <w:style w:customStyle="1" w:styleId="SectionNumber" w:type="character">
+  <w:style w:type="character" w:customStyle="1" w:styleId="SectionNumber">
     <w:name w:val="Section Number"/>
     <w:basedOn w:val="BodyTextChar"/>
   </w:style>
-  <w:style w:styleId="FootnoteReference" w:type="character">
+  <w:style w:type="character" w:styleId="FootnoteReference">
     <w:name w:val="Footnote Reference"/>
     <w:basedOn w:val="BodyTextChar"/>
     <w:rPr>
       <w:vertAlign w:val="superscript"/>
     </w:rPr>
   </w:style>
-  <w:style w:styleId="Hyperlink" w:type="character">
+  <w:style w:type="character" w:styleId="Hyperlink">
     <w:name w:val="Hyperlink"/>
     <w:basedOn w:val="BodyTextChar"/>
     <w:rPr>
-      <w:color w:themeColor="accent1" w:val="4F81BD"/>
-    </w:rPr>
-  </w:style>
-  <w:style w:styleId="TOCHeading" w:type="paragraph">
+      <w:color w:val="4F81BD" w:themeColor="accent1"/>
+    </w:rPr>
+  </w:style>
+  <w:style w:type="paragraph" w:styleId="TOCHeading">
     <w:name w:val="TOC Heading"/>
     <w:basedOn w:val="Heading1"/>
     <w:next w:val="BodyText"/>
@@ -2547,10 +2547,10 @@
       <w:outlineLvl w:val="9"/>
     </w:pPr>
     <w:rPr>
-      <w:rFonts w:ascii="TeX Gyre Schola" w:cstheme="majorBidi" w:eastAsiaTheme="majorEastAsia" w:hAnsi="TeX Gyre Schola"/>
+      <w:rFonts w:ascii="TeX Gyre Schola" w:eastAsiaTheme="majorEastAsia" w:hAnsi="TeX Gyre Schola" w:cstheme="majorBidi"/>
       <w:b w:val="0"/>
       <w:bCs w:val="0"/>
-      <w:color w:themeColor="accent1" w:themeShade="BF" w:val="365F91"/>
+      <w:color w:val="365F91" w:themeColor="accent1" w:themeShade="BF"/>
     </w:rPr>
   </w:style>
   <w:style w:type="paragraph" w:customStyle="1" w:styleId="SourceCode">

</xml_diff>

<commit_message>
exemplars(scotus): add searchable merits and amicus filings (fb-9fyu.3)
</commit_message>
<xml_diff>
--- a/courts/supreme-court-of-the-united-states/amicus-brief/usage/OUTPUT-amicus-brief.docx
+++ b/courts/supreme-court-of-the-united-states/amicus-brief/usage/OUTPUT-amicus-brief.docx
@@ -12,9 +12,7 @@
         <w:t xml:space="preserve">No. </w:t>
       </w:r>
       <w:r>
-        <w:t xml:space="preserve">22</w:t>
-        <w:noBreakHyphen/>
-        <w:t xml:space="preserve">451</w:t>
+        <w:t xml:space="preserve">22-⁠451</w:t>
       </w:r>
     </w:p>
     <w:p>
@@ -667,9 +665,7 @@
         <w:t xml:space="preserve"> </w:t>
       </w:r>
       <w:r>
-        <w:t xml:space="preserve">787</w:t>
-        <w:noBreakHyphen/>
-        <w:t xml:space="preserve">1060</w:t>
+        <w:t xml:space="preserve">787-⁠1060</w:t>
       </w:r>
     </w:p>
     <w:p>
@@ -4436,25 +4432,7 @@
         <w:t xml:space="preserve"> </w:t>
       </w:r>
       <w:r>
-        <w:t xml:space="preserve">at 66,553</w:t>
-      </w:r>
-      <w:r>
-        <w:noBreakHyphen/>
-      </w:r>
-      <w:r>
-        <w:t xml:space="preserve">66,554. Ever since the passage of the National Firearms Act of 1934 (NFA), Pub. L. No. 73</w:t>
-      </w:r>
-      <w:r>
-        <w:noBreakHyphen/>
-      </w:r>
-      <w:r>
-        <w:t xml:space="preserve">474, 48 Stat. 1236, and subsequent federal firearms statutes such as the Gun Control Act of 1968 (GCA), Pub. L. No. 90</w:t>
-      </w:r>
-      <w:r>
-        <w:noBreakHyphen/>
-      </w:r>
-      <w:r>
-        <w:t xml:space="preserve">618, 82 Stat. 1213, it is generally illegal to own a machinegun, 18 U.S.C. § 9⁠2⁠2⁠(⁠o⁠)⁠(⁠1⁠)⁠; indeed, it is a felony carrying up to 10 years in prison,</w:t>
+        <w:t xml:space="preserve">at 66,553-⁠66,554. Ever since the passage of the National Firearms Act of 1934 (NFA), Pub. L. No. 73-⁠474, 48 Stat. 1236, and subsequent federal firearms statutes such as the Gun Control Act of 1968 (GCA), Pub. L. No. 90-⁠618, 82 Stat. 1213, it is generally illegal to own a machinegun, 18 U.S.C. § 9⁠2⁠2⁠(⁠o⁠)⁠(⁠1⁠)⁠; indeed, it is a felony carrying up to 10 years in prison,</w:t>
       </w:r>
       <w:r>
         <w:t xml:space="preserve"> </w:t>
@@ -4541,13 +4519,7 @@
         <w:t xml:space="preserve"> </w:t>
       </w:r>
       <w:r>
-        <w:t xml:space="preserve">at 24,654</w:t>
-      </w:r>
-      <w:r>
-        <w:noBreakHyphen/>
-      </w:r>
-      <w:r>
-        <w:t xml:space="preserve">24,658.</w:t>
+        <w:t xml:space="preserve">at 24,654-⁠24,658.</w:t>
       </w:r>
       <w:r>
         <w:rPr>
@@ -4591,13 +4563,7 @@
         <w:t xml:space="preserve"> </w:t>
       </w:r>
       <w:r>
-        <w:t xml:space="preserve">at 24,727</w:t>
-      </w:r>
-      <w:r>
-        <w:noBreakHyphen/>
-      </w:r>
-      <w:r>
-        <w:t xml:space="preserve">24,730.</w:t>
+        <w:t xml:space="preserve">at 24,727-⁠24,730.</w:t>
       </w:r>
     </w:p>
     <w:p>
@@ -4647,13 +4613,7 @@
         <w:t xml:space="preserve"> </w:t>
       </w:r>
       <w:r>
-        <w:t xml:space="preserve">at 6,499</w:t>
-      </w:r>
-      <w:r>
-        <w:noBreakHyphen/>
-      </w:r>
-      <w:r>
-        <w:t xml:space="preserve">6,507, critics point out that this rule makes it more difficult for some individuals with physical limitations to use a firearm and it imposes additional costs on companies in the firearm industry.</w:t>
+        <w:t xml:space="preserve">at 6,499-⁠6,507, critics point out that this rule makes it more difficult for some individuals with physical limitations to use a firearm and it imposes additional costs on companies in the firearm industry.</w:t>
       </w:r>
       <w:r>
         <w:t xml:space="preserve"> </w:t>
@@ -4669,13 +4629,7 @@
         <w:t xml:space="preserve"> </w:t>
       </w:r>
       <w:r>
-        <w:t xml:space="preserve">at 6,507</w:t>
-      </w:r>
-      <w:r>
-        <w:noBreakHyphen/>
-      </w:r>
-      <w:r>
-        <w:t xml:space="preserve">6,521. There are substantial costs of various types imposed here because of reliance on the previous regulatory framework.</w:t>
+        <w:t xml:space="preserve">at 6,507-⁠6,521. There are substantial costs of various types imposed here because of reliance on the previous regulatory framework.</w:t>
       </w:r>
       <w:r>
         <w:t xml:space="preserve"> </w:t>
@@ -4691,13 +4645,7 @@
         <w:t xml:space="preserve"> </w:t>
       </w:r>
       <w:r>
-        <w:t xml:space="preserve">at 6,507</w:t>
-      </w:r>
-      <w:r>
-        <w:noBreakHyphen/>
-      </w:r>
-      <w:r>
-        <w:t xml:space="preserve">6,508.</w:t>
+        <w:t xml:space="preserve">at 6,507-⁠6,508.</w:t>
       </w:r>
     </w:p>
     <w:p>
@@ -5131,13 +5079,7 @@
         <w:t xml:space="preserve"> </w:t>
       </w:r>
       <w:r>
-        <w:t xml:space="preserve">at 717</w:t>
-      </w:r>
-      <w:r>
-        <w:noBreakHyphen/>
-      </w:r>
-      <w:r>
-        <w:t xml:space="preserve">718, so ATF would have prevailed even without clear congressional authorization. The Tenth Circuit similarly held that, although a different GCA provision unambiguously authorized ATF’s demand for information,</w:t>
+        <w:t xml:space="preserve">at 717-⁠718, so ATF would have prevailed even without clear congressional authorization. The Tenth Circuit similarly held that, although a different GCA provision unambiguously authorized ATF’s demand for information,</w:t>
       </w:r>
       <w:r>
         <w:t xml:space="preserve"> </w:t>
@@ -5246,13 +5188,7 @@
         <w:t xml:space="preserve">petition for cert. docketed</w:t>
       </w:r>
       <w:r>
-        <w:t xml:space="preserve">, No. 22</w:t>
-      </w:r>
-      <w:r>
-        <w:noBreakHyphen/>
-      </w:r>
-      <w:r>
-        <w:t xml:space="preserve">1222 (U.S. June 20, 2023), which concerns the bump stock rules, 83 Fed. Reg. 66,514. The D.C. Circuit followed this Court’s reasoning that, under</w:t>
+        <w:t xml:space="preserve">, No. 22-⁠1222 (U.S. June 20, 2023), which concerns the bump stock rules, 83 Fed. Reg. 66,514. The D.C. Circuit followed this Court’s reasoning that, under</w:t>
       </w:r>
       <w:r>
         <w:t xml:space="preserve"> </w:t>
@@ -5423,13 +5359,7 @@
         <w:t xml:space="preserve">See Guedes I</w:t>
       </w:r>
       <w:r>
-        <w:t xml:space="preserve">, 920 F.3d at 23</w:t>
-      </w:r>
-      <w:r>
-        <w:noBreakHyphen/>
-      </w:r>
-      <w:r>
-        <w:t xml:space="preserve">25. But such is the appeal of</w:t>
+        <w:t xml:space="preserve">, 920 F.3d at 23-⁠25. But such is the appeal of</w:t>
       </w:r>
       <w:r>
         <w:t xml:space="preserve"> </w:t>
@@ -5476,13 +5406,7 @@
         <w:t xml:space="preserve">Chevron</w:t>
       </w:r>
       <w:r>
-        <w:t xml:space="preserve">’s applicability. 140 S. Ct. at 789</w:t>
-      </w:r>
-      <w:r>
-        <w:noBreakHyphen/>
-      </w:r>
-      <w:r>
-        <w:t xml:space="preserve">791 (GORSUCH, J., statement respecting the denial of certiorari). Upon final judgment, the panel concluded that the statute unambiguously favored the government and thus that</w:t>
+        <w:t xml:space="preserve">’s applicability. 140 S. Ct. at 789-⁠791 (GORSUCH, J., statement respecting the denial of certiorari). Upon final judgment, the panel concluded that the statute unambiguously favored the government and thus that</w:t>
       </w:r>
       <w:r>
         <w:t xml:space="preserve"> </w:t>
@@ -5722,9 +5646,7 @@
         <w:t xml:space="preserve"> </w:t>
       </w:r>
       <w:r>
-        <w:t xml:space="preserve">787</w:t>
-        <w:noBreakHyphen/>
-        <w:t xml:space="preserve">1060</w:t>
+        <w:t xml:space="preserve">787-⁠1060</w:t>
       </w:r>
     </w:p>
     <w:p>
@@ -5969,9 +5891,7 @@
         <w:t xml:space="preserve"> </w:t>
       </w:r>
       <w:r>
-        <w:t xml:space="preserve">787</w:t>
-        <w:noBreakHyphen/>
-        <w:t xml:space="preserve">1060</w:t>
+        <w:t xml:space="preserve">787-⁠1060</w:t>
       </w:r>
     </w:p>
     <w:p>
@@ -6108,13 +6028,7 @@
         <w:t xml:space="preserve">The American Tradition of Self-Made Arms</w:t>
       </w:r>
       <w:r>
-        <w:t xml:space="preserve">, 54 St. Mary’s L. J. 35, 45</w:t>
-      </w:r>
-      <w:r>
-        <w:noBreakHyphen/>
-      </w:r>
-      <w:r>
-        <w:t xml:space="preserve">71 (2023);</w:t>
+        <w:t xml:space="preserve">, 54 St. Mary’s L. J. 35, 45-⁠71 (2023);</w:t>
       </w:r>
       <w:r>
         <w:t xml:space="preserve"> </w:t>

</xml_diff>

<commit_message>
fix(scotus amicus): cover rules and counsel block on page 1 in every engine, date at the left; DEF-COVER-002 gated (fb-595.78)
The cover now matches the NSSF exemplar's structure: a short rule closes
each part, counsel is set from the counsel indent, and the date sits at the
left margin as filed. The docx rule paragraph counted its border's space and
width on top of the 8 pt typst gives the rule, so the four rules cost 12 pt
more and pushed the counsel frame to page 2 (DEF-COVER-001, XENG-001/002);
it now fills the same 8 pt. All three engines pass DEF-COVER-002, so the
folder leaves data/cover-structure-baseline.txt and is gated.

Co-Authored-By: Claude Opus 5.5 <noreply@anthropic.com>
Gate: fb-595-78-a2 865085055e85050ee21e8b70c4ef165c53034b59
</commit_message>
<xml_diff>
--- a/courts/supreme-court-of-the-united-states/amicus-brief/usage/OUTPUT-amicus-brief.docx
+++ b/courts/supreme-court-of-the-united-states/amicus-brief/usage/OUTPUT-amicus-brief.docx
@@ -6,7 +6,7 @@
       <w:pPr>
         <w:spacing w:before="0" w:after="0" w:line="280" w:lineRule="exact"/>
         <w:ind w:left="0" w:firstLine="0"/>
-        <w:jc w:val="left"/>
+        <w:jc w:val="center"/>
       </w:pPr>
       <w:r>
         <w:t xml:space="preserve">No. </w:t>
@@ -41,6 +41,15 @@
     </w:p>
     <w:p>
       <w:pPr>
+        <w:pBdr>
+          <w:bottom w:val="single" w:sz="8" w:space="0" w:color="000000"/>
+        </w:pBdr>
+        <w:spacing w:before="120" w:after="0" w:line="20" w:lineRule="exact"/>
+        <w:ind w:left="1708" w:right="1708" w:firstLine="0"/>
+      </w:pPr>
+    </w:p>
+    <w:p>
+      <w:pPr>
         <w:spacing w:before="280" w:after="0" w:line="280" w:lineRule="exact"/>
         <w:ind w:left="0" w:firstLine="0"/>
         <w:jc w:val="center"/>
@@ -181,6 +190,15 @@
     </w:p>
     <w:p>
       <w:pPr>
+        <w:pBdr>
+          <w:bottom w:val="single" w:sz="8" w:space="0" w:color="000000"/>
+        </w:pBdr>
+        <w:spacing w:before="120" w:after="0" w:line="20" w:lineRule="exact"/>
+        <w:ind w:left="1708" w:right="1708" w:firstLine="0"/>
+      </w:pPr>
+    </w:p>
+    <w:p>
+      <w:pPr>
         <w:spacing w:before="280" w:after="0" w:line="280" w:lineRule="exact"/>
         <w:ind w:left="0" w:firstLine="0"/>
         <w:jc w:val="center"/>
@@ -287,6 +305,15 @@
     </w:p>
     <w:p>
       <w:pPr>
+        <w:pBdr>
+          <w:bottom w:val="single" w:sz="8" w:space="0" w:color="000000"/>
+        </w:pBdr>
+        <w:spacing w:before="120" w:after="0" w:line="20" w:lineRule="exact"/>
+        <w:ind w:left="1708" w:right="1708" w:firstLine="0"/>
+      </w:pPr>
+    </w:p>
+    <w:p>
+      <w:pPr>
         <w:spacing w:before="280" w:after="0" w:line="280" w:lineRule="exact"/>
         <w:ind w:left="0" w:firstLine="0"/>
         <w:jc w:val="center"/>
@@ -483,10 +510,19 @@
     </w:p>
     <w:p>
       <w:pPr>
+        <w:pBdr>
+          <w:bottom w:val="single" w:sz="8" w:space="0" w:color="000000"/>
+        </w:pBdr>
+        <w:spacing w:before="120" w:after="0" w:line="20" w:lineRule="exact"/>
+        <w:ind w:left="1708" w:right="1708" w:firstLine="0"/>
+      </w:pPr>
+    </w:p>
+    <w:p>
+      <w:pPr>
         <w:framePr w:wrap="notBeside" w:vAnchor="margin" w:hAnchor="margin" w:xAlign="center" w:yAlign="bottom" w:w="5937"/>
         <w:spacing w:before="0" w:after="0" w:line="280" w:lineRule="exact"/>
-        <w:ind w:left="0" w:firstLine="0"/>
-        <w:jc w:val="center"/>
+        <w:ind w:left="2016" w:firstLine="0"/>
+        <w:jc w:val="left"/>
       </w:pPr>
       <w:r>
         <w:t xml:space="preserve">H.</w:t>
@@ -508,8 +544,8 @@
       <w:pPr>
         <w:framePr w:wrap="notBeside" w:vAnchor="margin" w:hAnchor="margin" w:xAlign="center" w:yAlign="bottom" w:w="5937"/>
         <w:spacing w:before="0" w:after="0" w:line="280" w:lineRule="exact"/>
-        <w:ind w:left="0" w:firstLine="0"/>
-        <w:jc w:val="center"/>
+        <w:ind w:left="2016" w:firstLine="0"/>
+        <w:jc w:val="left"/>
       </w:pPr>
       <w:r>
         <w:rPr>
@@ -551,8 +587,8 @@
       <w:pPr>
         <w:framePr w:wrap="notBeside" w:vAnchor="margin" w:hAnchor="margin" w:xAlign="center" w:yAlign="bottom" w:w="5937"/>
         <w:spacing w:before="0" w:after="0" w:line="280" w:lineRule="exact"/>
-        <w:ind w:left="0" w:firstLine="0"/>
-        <w:jc w:val="center"/>
+        <w:ind w:left="2016" w:firstLine="0"/>
+        <w:jc w:val="left"/>
       </w:pPr>
       <w:r>
         <w:t xml:space="preserve">SCHAERR</w:t>
@@ -580,8 +616,8 @@
       <w:pPr>
         <w:framePr w:wrap="notBeside" w:vAnchor="margin" w:hAnchor="margin" w:xAlign="center" w:yAlign="bottom" w:w="5937"/>
         <w:spacing w:before="0" w:after="0" w:line="280" w:lineRule="exact"/>
-        <w:ind w:left="0" w:firstLine="0"/>
-        <w:jc w:val="center"/>
+        <w:ind w:left="2016" w:firstLine="0"/>
+        <w:jc w:val="left"/>
       </w:pPr>
       <w:r>
         <w:t xml:space="preserve">1717</w:t>
@@ -621,8 +657,8 @@
       <w:pPr>
         <w:framePr w:wrap="notBeside" w:vAnchor="margin" w:hAnchor="margin" w:xAlign="center" w:yAlign="bottom" w:w="5937"/>
         <w:spacing w:before="0" w:after="0" w:line="280" w:lineRule="exact"/>
-        <w:ind w:left="0" w:firstLine="0"/>
-        <w:jc w:val="center"/>
+        <w:ind w:left="2016" w:firstLine="0"/>
+        <w:jc w:val="left"/>
       </w:pPr>
       <w:r>
         <w:t xml:space="preserve">Washington,</w:t>
@@ -644,8 +680,8 @@
       <w:pPr>
         <w:framePr w:wrap="notBeside" w:vAnchor="margin" w:hAnchor="margin" w:xAlign="center" w:yAlign="bottom" w:w="5937"/>
         <w:spacing w:before="0" w:after="0" w:line="280" w:lineRule="exact"/>
-        <w:ind w:left="0" w:firstLine="0"/>
-        <w:jc w:val="center"/>
+        <w:ind w:left="2016" w:firstLine="0"/>
+        <w:jc w:val="left"/>
       </w:pPr>
       <w:r>
         <w:t xml:space="preserve">cbartolomucci@schaerr-jaffe.com</w:t>
@@ -655,8 +691,8 @@
       <w:pPr>
         <w:framePr w:wrap="notBeside" w:vAnchor="margin" w:hAnchor="margin" w:xAlign="center" w:yAlign="bottom" w:w="5937"/>
         <w:spacing w:before="0" w:after="0" w:line="280" w:lineRule="exact"/>
-        <w:ind w:left="0" w:firstLine="0"/>
-        <w:jc w:val="center"/>
+        <w:ind w:left="2016" w:firstLine="0"/>
+        <w:jc w:val="left"/>
       </w:pPr>
       <w:r>
         <w:t xml:space="preserve">(202)</w:t>
@@ -666,6 +702,109 @@
       </w:r>
       <w:r>
         <w:t xml:space="preserve">787-⁠1060</w:t>
+      </w:r>
+    </w:p>
+    <w:p>
+      <w:pPr>
+        <w:framePr w:wrap="notBeside" w:vAnchor="margin" w:hAnchor="margin" w:xAlign="center" w:yAlign="bottom" w:w="5937"/>
+        <w:spacing w:before="240" w:after="0" w:line="280" w:lineRule="exact"/>
+        <w:ind w:left="2016" w:firstLine="0"/>
+        <w:jc w:val="left"/>
+      </w:pPr>
+      <w:r>
+        <w:t xml:space="preserve">BRIAN</w:t>
+      </w:r>
+      <w:r>
+        <w:t xml:space="preserve"> </w:t>
+      </w:r>
+      <w:r>
+        <w:t xml:space="preserve">J.</w:t>
+      </w:r>
+      <w:r>
+        <w:t xml:space="preserve"> </w:t>
+      </w:r>
+      <w:r>
+        <w:t xml:space="preserve">FIELD</w:t>
+      </w:r>
+    </w:p>
+    <w:p>
+      <w:pPr>
+        <w:framePr w:wrap="notBeside" w:vAnchor="margin" w:hAnchor="margin" w:xAlign="center" w:yAlign="bottom" w:w="5937"/>
+        <w:spacing w:before="0" w:after="0" w:line="280" w:lineRule="exact"/>
+        <w:ind w:left="2016" w:firstLine="0"/>
+        <w:jc w:val="left"/>
+      </w:pPr>
+      <w:r>
+        <w:t xml:space="preserve">KENNETH</w:t>
+      </w:r>
+      <w:r>
+        <w:t xml:space="preserve"> </w:t>
+      </w:r>
+      <w:r>
+        <w:t xml:space="preserve">A.</w:t>
+      </w:r>
+      <w:r>
+        <w:t xml:space="preserve"> </w:t>
+      </w:r>
+      <w:r>
+        <w:t xml:space="preserve">KLUKOWSKI</w:t>
+      </w:r>
+    </w:p>
+    <w:p>
+      <w:pPr>
+        <w:framePr w:wrap="notBeside" w:vAnchor="margin" w:hAnchor="margin" w:xAlign="center" w:yAlign="bottom" w:w="5937"/>
+        <w:spacing w:before="240" w:after="0" w:line="280" w:lineRule="exact"/>
+        <w:ind w:left="2016" w:firstLine="0"/>
+        <w:jc w:val="left"/>
+      </w:pPr>
+      <w:r>
+        <w:rPr>
+          <w:i/>
+          <w:iCs/>
+        </w:rPr>
+        <w:t xml:space="preserve">Counsel</w:t>
+      </w:r>
+      <w:r>
+        <w:rPr>
+          <w:i/>
+          <w:iCs/>
+        </w:rPr>
+        <w:t xml:space="preserve"> </w:t>
+      </w:r>
+      <w:r>
+        <w:rPr>
+          <w:i/>
+          <w:iCs/>
+        </w:rPr>
+        <w:t xml:space="preserve">for</w:t>
+      </w:r>
+      <w:r>
+        <w:rPr>
+          <w:i/>
+          <w:iCs/>
+        </w:rPr>
+        <w:t xml:space="preserve"> </w:t>
+      </w:r>
+      <w:r>
+        <w:rPr>
+          <w:i/>
+          <w:iCs/>
+        </w:rPr>
+        <w:t xml:space="preserve">Amicus</w:t>
+      </w:r>
+      <w:r>
+        <w:rPr>
+          <w:i/>
+          <w:iCs/>
+        </w:rPr>
+        <w:t xml:space="preserve"> </w:t>
+      </w:r>
+      <w:r>
+        <w:rPr>
+          <w:i/>
+          <w:iCs/>
+        </w:rPr>
+        <w:t xml:space="preserve">Curiae</w:t>
       </w:r>
     </w:p>
     <w:p>
@@ -673,110 +812,7 @@
         <w:framePr w:wrap="notBeside" w:vAnchor="margin" w:hAnchor="margin" w:xAlign="center" w:yAlign="bottom" w:w="5937"/>
         <w:spacing w:before="240" w:after="0" w:line="280" w:lineRule="exact"/>
         <w:ind w:left="0" w:firstLine="0"/>
-        <w:jc w:val="center"/>
-      </w:pPr>
-      <w:r>
-        <w:t xml:space="preserve">BRIAN</w:t>
-      </w:r>
-      <w:r>
-        <w:t xml:space="preserve"> </w:t>
-      </w:r>
-      <w:r>
-        <w:t xml:space="preserve">J.</w:t>
-      </w:r>
-      <w:r>
-        <w:t xml:space="preserve"> </w:t>
-      </w:r>
-      <w:r>
-        <w:t xml:space="preserve">FIELD</w:t>
-      </w:r>
-    </w:p>
-    <w:p>
-      <w:pPr>
-        <w:framePr w:wrap="notBeside" w:vAnchor="margin" w:hAnchor="margin" w:xAlign="center" w:yAlign="bottom" w:w="5937"/>
-        <w:spacing w:before="0" w:after="0" w:line="280" w:lineRule="exact"/>
-        <w:ind w:left="0" w:firstLine="0"/>
-        <w:jc w:val="center"/>
-      </w:pPr>
-      <w:r>
-        <w:t xml:space="preserve">KENNETH</w:t>
-      </w:r>
-      <w:r>
-        <w:t xml:space="preserve"> </w:t>
-      </w:r>
-      <w:r>
-        <w:t xml:space="preserve">A.</w:t>
-      </w:r>
-      <w:r>
-        <w:t xml:space="preserve"> </w:t>
-      </w:r>
-      <w:r>
-        <w:t xml:space="preserve">KLUKOWSKI</w:t>
-      </w:r>
-    </w:p>
-    <w:p>
-      <w:pPr>
-        <w:framePr w:wrap="notBeside" w:vAnchor="margin" w:hAnchor="margin" w:xAlign="center" w:yAlign="bottom" w:w="5937"/>
-        <w:spacing w:before="240" w:after="0" w:line="280" w:lineRule="exact"/>
-        <w:ind w:left="0" w:firstLine="0"/>
-        <w:jc w:val="center"/>
-      </w:pPr>
-      <w:r>
-        <w:rPr>
-          <w:i/>
-          <w:iCs/>
-        </w:rPr>
-        <w:t xml:space="preserve">Counsel</w:t>
-      </w:r>
-      <w:r>
-        <w:rPr>
-          <w:i/>
-          <w:iCs/>
-        </w:rPr>
-        <w:t xml:space="preserve"> </w:t>
-      </w:r>
-      <w:r>
-        <w:rPr>
-          <w:i/>
-          <w:iCs/>
-        </w:rPr>
-        <w:t xml:space="preserve">for</w:t>
-      </w:r>
-      <w:r>
-        <w:rPr>
-          <w:i/>
-          <w:iCs/>
-        </w:rPr>
-        <w:t xml:space="preserve"> </w:t>
-      </w:r>
-      <w:r>
-        <w:rPr>
-          <w:i/>
-          <w:iCs/>
-        </w:rPr>
-        <w:t xml:space="preserve">Amicus</w:t>
-      </w:r>
-      <w:r>
-        <w:rPr>
-          <w:i/>
-          <w:iCs/>
-        </w:rPr>
-        <w:t xml:space="preserve"> </w:t>
-      </w:r>
-      <w:r>
-        <w:rPr>
-          <w:i/>
-          <w:iCs/>
-        </w:rPr>
-        <w:t xml:space="preserve">Curiae</w:t>
-      </w:r>
-    </w:p>
-    <w:p>
-      <w:pPr>
-        <w:framePr w:wrap="notBeside" w:vAnchor="margin" w:hAnchor="margin" w:xAlign="center" w:yAlign="bottom" w:w="5937"/>
-        <w:spacing w:before="240" w:after="0" w:line="280" w:lineRule="exact"/>
-        <w:ind w:left="0" w:firstLine="0"/>
-        <w:jc w:val="center"/>
+        <w:jc w:val="left"/>
       </w:pPr>
       <w:r>
         <w:t xml:space="preserve">July</w:t>

</xml_diff>